<commit_message>
Update Capitulo 1 to late version
</commit_message>
<xml_diff>
--- a/docs/Capítulo 1 - Introducción (y objetivos).docx
+++ b/docs/Capítulo 1 - Introducción (y objetivos).docx
@@ -1924,25 +1924,7 @@
           <w:sz w:val="24"/>
           <w:szCs w:val="24"/>
         </w:rPr>
-        <w:t xml:space="preserve">(Nótese que entre cada epígrafe y el texto que continúa hay siempre un espacio de 1 [INTRO], entre párrafos consecutivos también hay un espacio de 1 [INTRO], y entre el último párrafo de un apartado y el siguiente epígrafe hay un espacio de 2 [INTRO]’s. Debe procurarse respetar este formato en todo el documento, también en el resto de </w:t>
-      </w:r>
-      <w:proofErr w:type="gramStart"/>
-      <w:r>
-        <w:rPr>
-          <w:rFonts w:ascii="Times New Roman" w:eastAsia="Times New Roman" w:hAnsi="Times New Roman" w:cs="Times New Roman"/>
-          <w:sz w:val="24"/>
-          <w:szCs w:val="24"/>
-        </w:rPr>
-        <w:t>capítulos</w:t>
-      </w:r>
-      <w:proofErr w:type="gramEnd"/>
-      <w:r>
-        <w:rPr>
-          <w:rFonts w:ascii="Times New Roman" w:eastAsia="Times New Roman" w:hAnsi="Times New Roman" w:cs="Times New Roman"/>
-          <w:sz w:val="24"/>
-          <w:szCs w:val="24"/>
-        </w:rPr>
-        <w:t>).</w:t>
+        <w:t>(Nótese que entre cada epígrafe y el texto que continúa hay siempre un espacio de 1 [INTRO], entre párrafos consecutivos también hay un espacio de 1 [INTRO], y entre el último párrafo de un apartado y el siguiente epígrafe hay un espacio de 2 [INTRO]’s. Debe procurarse respetar este formato en todo el documento, también en el resto de capítulos).</w:t>
       </w:r>
     </w:p>
     <w:p>
@@ -2108,7 +2090,7 @@
           <w:sz w:val="28"/>
           <w:szCs w:val="28"/>
         </w:rPr>
-        <w:t>1.</w:t>
+        <w:t>1.3.1.- Objetivo</w:t>
       </w:r>
       <w:r>
         <w:rPr>
@@ -2116,7 +2098,7 @@
           <w:sz w:val="28"/>
           <w:szCs w:val="28"/>
         </w:rPr>
-        <w:t>3</w:t>
+        <w:t>s</w:t>
       </w:r>
       <w:r>
         <w:rPr>
@@ -2124,7 +2106,7 @@
           <w:sz w:val="28"/>
           <w:szCs w:val="28"/>
         </w:rPr>
-        <w:t xml:space="preserve">.1.- </w:t>
+        <w:t xml:space="preserve"> </w:t>
       </w:r>
       <w:r>
         <w:rPr>
@@ -2132,23 +2114,149 @@
           <w:sz w:val="28"/>
           <w:szCs w:val="28"/>
         </w:rPr>
-        <w:t>Objetivo</w:t>
-      </w:r>
-      <w:r>
+        <w:t>principales</w:t>
+      </w:r>
+    </w:p>
+    <w:p>
+      <w:pPr>
+        <w:pBdr>
+          <w:top w:val="nil"/>
+          <w:left w:val="nil"/>
+          <w:bottom w:val="nil"/>
+          <w:right w:val="nil"/>
+          <w:between w:val="nil"/>
+        </w:pBdr>
+        <w:jc w:val="both"/>
+        <w:rPr>
+          <w:rFonts w:ascii="Times New Roman" w:eastAsia="Times New Roman" w:hAnsi="Times New Roman" w:cs="Times New Roman"/>
+          <w:sz w:val="24"/>
+          <w:szCs w:val="24"/>
+        </w:rPr>
+      </w:pPr>
+    </w:p>
+    <w:p>
+      <w:pPr>
+        <w:pBdr>
+          <w:top w:val="nil"/>
+          <w:left w:val="nil"/>
+          <w:bottom w:val="nil"/>
+          <w:right w:val="nil"/>
+          <w:between w:val="nil"/>
+        </w:pBdr>
+        <w:jc w:val="both"/>
+        <w:rPr>
+          <w:rFonts w:ascii="Times New Roman" w:eastAsia="Times New Roman" w:hAnsi="Times New Roman" w:cs="Times New Roman"/>
+          <w:sz w:val="24"/>
+          <w:szCs w:val="24"/>
+        </w:rPr>
+      </w:pPr>
+      <w:r>
+        <w:rPr>
+          <w:rFonts w:ascii="Times New Roman" w:eastAsia="Times New Roman" w:hAnsi="Times New Roman" w:cs="Times New Roman"/>
+          <w:sz w:val="24"/>
+          <w:szCs w:val="24"/>
+        </w:rPr>
+        <w:t>El objetivo principal de este proyecto es el desarrollo de una aplicación web que permita gestionar de forma eficiente el cuidado de las mascotas mediante una herramienta accesible y fácil de utilizar por parte de los distintos cuidadores.</w:t>
+      </w:r>
+    </w:p>
+    <w:p>
+      <w:pPr>
+        <w:pBdr>
+          <w:top w:val="nil"/>
+          <w:left w:val="nil"/>
+          <w:bottom w:val="nil"/>
+          <w:right w:val="nil"/>
+          <w:between w:val="nil"/>
+        </w:pBdr>
+        <w:jc w:val="both"/>
+        <w:rPr>
+          <w:rFonts w:ascii="Times New Roman" w:eastAsia="Times New Roman" w:hAnsi="Times New Roman" w:cs="Times New Roman"/>
+          <w:sz w:val="24"/>
+          <w:szCs w:val="24"/>
+        </w:rPr>
+      </w:pPr>
+    </w:p>
+    <w:p>
+      <w:pPr>
+        <w:pBdr>
+          <w:top w:val="nil"/>
+          <w:left w:val="nil"/>
+          <w:bottom w:val="nil"/>
+          <w:right w:val="nil"/>
+          <w:between w:val="nil"/>
+        </w:pBdr>
+        <w:jc w:val="both"/>
+        <w:rPr>
+          <w:rFonts w:ascii="Times New Roman" w:eastAsia="Times New Roman" w:hAnsi="Times New Roman" w:cs="Times New Roman"/>
+          <w:sz w:val="24"/>
+          <w:szCs w:val="24"/>
+        </w:rPr>
+      </w:pPr>
+      <w:r>
+        <w:rPr>
+          <w:rFonts w:ascii="Times New Roman" w:eastAsia="Times New Roman" w:hAnsi="Times New Roman" w:cs="Times New Roman"/>
+          <w:sz w:val="24"/>
+          <w:szCs w:val="24"/>
+        </w:rPr>
+        <w:t>Para alcanzar este objetivo general, la aplicación deberá permitir registrar información relevante sobre las mascotas y facilitar la coordinación entre los distintos usuarios responsables de su cuidado. De esta manera, se pretende centralizar toda la información relacionada con el bienestar del animal y mejorar la organización de las tareas asociadas a su atención diaria.</w:t>
+      </w:r>
+    </w:p>
+    <w:p>
+      <w:pPr>
+        <w:pBdr>
+          <w:top w:val="nil"/>
+          <w:left w:val="nil"/>
+          <w:bottom w:val="nil"/>
+          <w:right w:val="nil"/>
+          <w:between w:val="nil"/>
+        </w:pBdr>
+        <w:jc w:val="both"/>
+        <w:rPr>
+          <w:rFonts w:ascii="Times New Roman" w:eastAsia="Times New Roman" w:hAnsi="Times New Roman" w:cs="Times New Roman"/>
+          <w:sz w:val="24"/>
+          <w:szCs w:val="24"/>
+        </w:rPr>
+      </w:pPr>
+    </w:p>
+    <w:p>
+      <w:pPr>
+        <w:pBdr>
+          <w:top w:val="nil"/>
+          <w:left w:val="nil"/>
+          <w:bottom w:val="nil"/>
+          <w:right w:val="nil"/>
+          <w:between w:val="nil"/>
+        </w:pBdr>
+        <w:jc w:val="both"/>
+        <w:rPr>
+          <w:rFonts w:ascii="Times New Roman" w:eastAsia="Times New Roman" w:hAnsi="Times New Roman" w:cs="Times New Roman"/>
+          <w:sz w:val="24"/>
+          <w:szCs w:val="24"/>
+        </w:rPr>
+      </w:pPr>
+    </w:p>
+    <w:p>
+      <w:pPr>
+        <w:pBdr>
+          <w:top w:val="nil"/>
+          <w:left w:val="nil"/>
+          <w:bottom w:val="nil"/>
+          <w:right w:val="nil"/>
+          <w:between w:val="nil"/>
+        </w:pBdr>
         <w:rPr>
           <w:b/>
           <w:sz w:val="28"/>
           <w:szCs w:val="28"/>
         </w:rPr>
-        <w:t>s</w:t>
-      </w:r>
+      </w:pPr>
       <w:r>
         <w:rPr>
           <w:b/>
           <w:sz w:val="28"/>
           <w:szCs w:val="28"/>
         </w:rPr>
-        <w:t xml:space="preserve"> </w:t>
+        <w:t xml:space="preserve">1.3.2.- Objetivos </w:t>
       </w:r>
       <w:r>
         <w:rPr>
@@ -2156,52 +2264,231 @@
           <w:sz w:val="28"/>
           <w:szCs w:val="28"/>
         </w:rPr>
-        <w:t>principales</w:t>
-      </w:r>
-    </w:p>
-    <w:p>
-      <w:pPr>
-        <w:pBdr>
-          <w:top w:val="nil"/>
-          <w:left w:val="nil"/>
-          <w:bottom w:val="nil"/>
-          <w:right w:val="nil"/>
-          <w:between w:val="nil"/>
-        </w:pBdr>
-        <w:jc w:val="both"/>
-        <w:rPr>
-          <w:rFonts w:ascii="Times New Roman" w:eastAsia="Times New Roman" w:hAnsi="Times New Roman" w:cs="Times New Roman"/>
-          <w:sz w:val="24"/>
-          <w:szCs w:val="24"/>
-        </w:rPr>
-      </w:pPr>
-    </w:p>
-    <w:p>
-      <w:pPr>
-        <w:pBdr>
-          <w:top w:val="nil"/>
-          <w:left w:val="nil"/>
-          <w:bottom w:val="nil"/>
-          <w:right w:val="nil"/>
-          <w:between w:val="nil"/>
-        </w:pBdr>
-        <w:jc w:val="both"/>
-        <w:rPr>
-          <w:rFonts w:ascii="Times New Roman" w:eastAsia="Times New Roman" w:hAnsi="Times New Roman" w:cs="Times New Roman"/>
-          <w:sz w:val="24"/>
-          <w:szCs w:val="24"/>
-        </w:rPr>
-      </w:pPr>
-      <w:proofErr w:type="spellStart"/>
-      <w:r>
-        <w:rPr>
-          <w:rFonts w:ascii="Times New Roman" w:eastAsia="Times New Roman" w:hAnsi="Times New Roman" w:cs="Times New Roman"/>
-          <w:sz w:val="24"/>
-          <w:szCs w:val="24"/>
-        </w:rPr>
-        <w:t>ssdfdfdsf</w:t>
-      </w:r>
-      <w:proofErr w:type="spellEnd"/>
+        <w:t>secundarios</w:t>
+      </w:r>
+    </w:p>
+    <w:p>
+      <w:pPr>
+        <w:pBdr>
+          <w:top w:val="nil"/>
+          <w:left w:val="nil"/>
+          <w:bottom w:val="nil"/>
+          <w:right w:val="nil"/>
+          <w:between w:val="nil"/>
+        </w:pBdr>
+        <w:jc w:val="both"/>
+        <w:rPr>
+          <w:rFonts w:ascii="Times New Roman" w:eastAsia="Times New Roman" w:hAnsi="Times New Roman" w:cs="Times New Roman"/>
+          <w:sz w:val="24"/>
+          <w:szCs w:val="24"/>
+        </w:rPr>
+      </w:pPr>
+    </w:p>
+    <w:p>
+      <w:pPr>
+        <w:pBdr>
+          <w:top w:val="nil"/>
+          <w:left w:val="nil"/>
+          <w:bottom w:val="nil"/>
+          <w:right w:val="nil"/>
+          <w:between w:val="nil"/>
+        </w:pBdr>
+        <w:jc w:val="both"/>
+        <w:rPr>
+          <w:rFonts w:ascii="Times New Roman" w:eastAsia="Times New Roman" w:hAnsi="Times New Roman" w:cs="Times New Roman"/>
+          <w:sz w:val="24"/>
+          <w:szCs w:val="24"/>
+        </w:rPr>
+      </w:pPr>
+      <w:r>
+        <w:rPr>
+          <w:rFonts w:ascii="Times New Roman" w:eastAsia="Times New Roman" w:hAnsi="Times New Roman" w:cs="Times New Roman"/>
+          <w:sz w:val="24"/>
+          <w:szCs w:val="24"/>
+        </w:rPr>
+        <w:t>Con el fin de cumplir el objetivo principal del proyecto, se plantean una serie de objetivos secundarios que definen las funcionalidades que deberá ofrecer la aplicación:</w:t>
+      </w:r>
+    </w:p>
+    <w:p>
+      <w:pPr>
+        <w:pStyle w:val="Prrafodelista"/>
+        <w:numPr>
+          <w:ilvl w:val="0"/>
+          <w:numId w:val="4"/>
+        </w:numPr>
+        <w:pBdr>
+          <w:top w:val="nil"/>
+          <w:left w:val="nil"/>
+          <w:bottom w:val="nil"/>
+          <w:right w:val="nil"/>
+          <w:between w:val="nil"/>
+        </w:pBdr>
+        <w:jc w:val="both"/>
+        <w:rPr>
+          <w:rFonts w:ascii="Times New Roman" w:eastAsia="Times New Roman" w:hAnsi="Times New Roman" w:cs="Times New Roman"/>
+          <w:sz w:val="24"/>
+          <w:szCs w:val="24"/>
+        </w:rPr>
+      </w:pPr>
+      <w:r>
+        <w:rPr>
+          <w:rFonts w:ascii="Times New Roman" w:eastAsia="Times New Roman" w:hAnsi="Times New Roman" w:cs="Times New Roman"/>
+          <w:sz w:val="24"/>
+          <w:szCs w:val="24"/>
+        </w:rPr>
+        <w:t>Implementar un sistema de registro y autenticación de usuarios que permita acceder de forma segura a la aplicación.</w:t>
+      </w:r>
+    </w:p>
+    <w:p>
+      <w:pPr>
+        <w:pStyle w:val="Prrafodelista"/>
+        <w:numPr>
+          <w:ilvl w:val="0"/>
+          <w:numId w:val="4"/>
+        </w:numPr>
+        <w:pBdr>
+          <w:top w:val="nil"/>
+          <w:left w:val="nil"/>
+          <w:bottom w:val="nil"/>
+          <w:right w:val="nil"/>
+          <w:between w:val="nil"/>
+        </w:pBdr>
+        <w:jc w:val="both"/>
+        <w:rPr>
+          <w:rFonts w:ascii="Times New Roman" w:eastAsia="Times New Roman" w:hAnsi="Times New Roman" w:cs="Times New Roman"/>
+          <w:sz w:val="24"/>
+          <w:szCs w:val="24"/>
+        </w:rPr>
+      </w:pPr>
+      <w:r>
+        <w:rPr>
+          <w:rFonts w:ascii="Times New Roman" w:eastAsia="Times New Roman" w:hAnsi="Times New Roman" w:cs="Times New Roman"/>
+          <w:sz w:val="24"/>
+          <w:szCs w:val="24"/>
+        </w:rPr>
+        <w:t>Permitir el registro y la gestión de mascotas, incluyendo información relevante sobre cada una de elllas.</w:t>
+      </w:r>
+    </w:p>
+    <w:p>
+      <w:pPr>
+        <w:pStyle w:val="Prrafodelista"/>
+        <w:numPr>
+          <w:ilvl w:val="0"/>
+          <w:numId w:val="4"/>
+        </w:numPr>
+        <w:pBdr>
+          <w:top w:val="nil"/>
+          <w:left w:val="nil"/>
+          <w:bottom w:val="nil"/>
+          <w:right w:val="nil"/>
+          <w:between w:val="nil"/>
+        </w:pBdr>
+        <w:jc w:val="both"/>
+        <w:rPr>
+          <w:rFonts w:ascii="Times New Roman" w:eastAsia="Times New Roman" w:hAnsi="Times New Roman" w:cs="Times New Roman"/>
+          <w:sz w:val="24"/>
+          <w:szCs w:val="24"/>
+        </w:rPr>
+      </w:pPr>
+      <w:r>
+        <w:rPr>
+          <w:rFonts w:ascii="Times New Roman" w:eastAsia="Times New Roman" w:hAnsi="Times New Roman" w:cs="Times New Roman"/>
+          <w:sz w:val="24"/>
+          <w:szCs w:val="24"/>
+        </w:rPr>
+        <w:lastRenderedPageBreak/>
+        <w:t>Desarrollar un sistema que permita registrar y gestionar tratamientos médicos de las mascotas, incluyendo horarios y seguimiento de la administración de medicación.</w:t>
+      </w:r>
+    </w:p>
+    <w:p>
+      <w:pPr>
+        <w:pStyle w:val="Prrafodelista"/>
+        <w:numPr>
+          <w:ilvl w:val="0"/>
+          <w:numId w:val="4"/>
+        </w:numPr>
+        <w:pBdr>
+          <w:top w:val="nil"/>
+          <w:left w:val="nil"/>
+          <w:bottom w:val="nil"/>
+          <w:right w:val="nil"/>
+          <w:between w:val="nil"/>
+        </w:pBdr>
+        <w:jc w:val="both"/>
+        <w:rPr>
+          <w:rFonts w:ascii="Times New Roman" w:eastAsia="Times New Roman" w:hAnsi="Times New Roman" w:cs="Times New Roman"/>
+          <w:sz w:val="24"/>
+          <w:szCs w:val="24"/>
+        </w:rPr>
+      </w:pPr>
+      <w:r>
+        <w:rPr>
+          <w:rFonts w:ascii="Times New Roman" w:eastAsia="Times New Roman" w:hAnsi="Times New Roman" w:cs="Times New Roman"/>
+          <w:sz w:val="24"/>
+          <w:szCs w:val="24"/>
+        </w:rPr>
+        <w:t>Incorporar funcionalidades para registrar otras actividades relacionadas con el cuidado de las mascotas, como la alimentación o los paseos.</w:t>
+      </w:r>
+    </w:p>
+    <w:p>
+      <w:pPr>
+        <w:pStyle w:val="Prrafodelista"/>
+        <w:numPr>
+          <w:ilvl w:val="0"/>
+          <w:numId w:val="4"/>
+        </w:numPr>
+        <w:pBdr>
+          <w:top w:val="nil"/>
+          <w:left w:val="nil"/>
+          <w:bottom w:val="nil"/>
+          <w:right w:val="nil"/>
+          <w:between w:val="nil"/>
+        </w:pBdr>
+        <w:jc w:val="both"/>
+        <w:rPr>
+          <w:rFonts w:ascii="Times New Roman" w:eastAsia="Times New Roman" w:hAnsi="Times New Roman" w:cs="Times New Roman"/>
+          <w:sz w:val="24"/>
+          <w:szCs w:val="24"/>
+        </w:rPr>
+      </w:pPr>
+      <w:r>
+        <w:rPr>
+          <w:rFonts w:ascii="Times New Roman" w:eastAsia="Times New Roman" w:hAnsi="Times New Roman" w:cs="Times New Roman"/>
+          <w:sz w:val="24"/>
+          <w:szCs w:val="24"/>
+        </w:rPr>
+        <w:t>Permitir la participación de varios usuarios en el cuidado de una misma mascota, facilitando la coordinación entre los distintos cuidadores.</w:t>
+      </w:r>
+    </w:p>
+    <w:p>
+      <w:pPr>
+        <w:pStyle w:val="Prrafodelista"/>
+        <w:numPr>
+          <w:ilvl w:val="0"/>
+          <w:numId w:val="4"/>
+        </w:numPr>
+        <w:pBdr>
+          <w:top w:val="nil"/>
+          <w:left w:val="nil"/>
+          <w:bottom w:val="nil"/>
+          <w:right w:val="nil"/>
+          <w:between w:val="nil"/>
+        </w:pBdr>
+        <w:jc w:val="both"/>
+        <w:rPr>
+          <w:rFonts w:ascii="Times New Roman" w:eastAsia="Times New Roman" w:hAnsi="Times New Roman" w:cs="Times New Roman"/>
+          <w:sz w:val="24"/>
+          <w:szCs w:val="24"/>
+        </w:rPr>
+      </w:pPr>
+      <w:r>
+        <w:rPr>
+          <w:rFonts w:ascii="Times New Roman" w:eastAsia="Times New Roman" w:hAnsi="Times New Roman" w:cs="Times New Roman"/>
+          <w:sz w:val="24"/>
+          <w:szCs w:val="24"/>
+        </w:rPr>
+        <w:t>Almacenar toda la información generada en una base de datos que permita consultar el historial de actividades realizadas.</w:t>
+      </w:r>
     </w:p>
     <w:p>
       <w:pPr>
@@ -2258,7 +2545,7 @@
           <w:sz w:val="28"/>
           <w:szCs w:val="28"/>
         </w:rPr>
-        <w:t>1.</w:t>
+        <w:t xml:space="preserve">1.3.3.- </w:t>
       </w:r>
       <w:r>
         <w:rPr>
@@ -2266,188 +2553,6 @@
           <w:sz w:val="28"/>
           <w:szCs w:val="28"/>
         </w:rPr>
-        <w:t>3</w:t>
-      </w:r>
-      <w:r>
-        <w:rPr>
-          <w:b/>
-          <w:sz w:val="28"/>
-          <w:szCs w:val="28"/>
-        </w:rPr>
-        <w:t>.</w:t>
-      </w:r>
-      <w:r>
-        <w:rPr>
-          <w:b/>
-          <w:sz w:val="28"/>
-          <w:szCs w:val="28"/>
-        </w:rPr>
-        <w:t>2</w:t>
-      </w:r>
-      <w:r>
-        <w:rPr>
-          <w:b/>
-          <w:sz w:val="28"/>
-          <w:szCs w:val="28"/>
-        </w:rPr>
-        <w:t xml:space="preserve">.- </w:t>
-      </w:r>
-      <w:r>
-        <w:rPr>
-          <w:b/>
-          <w:sz w:val="28"/>
-          <w:szCs w:val="28"/>
-        </w:rPr>
-        <w:t xml:space="preserve">Objetivos </w:t>
-      </w:r>
-      <w:r>
-        <w:rPr>
-          <w:b/>
-          <w:sz w:val="28"/>
-          <w:szCs w:val="28"/>
-        </w:rPr>
-        <w:t>secundarios</w:t>
-      </w:r>
-    </w:p>
-    <w:p>
-      <w:pPr>
-        <w:pBdr>
-          <w:top w:val="nil"/>
-          <w:left w:val="nil"/>
-          <w:bottom w:val="nil"/>
-          <w:right w:val="nil"/>
-          <w:between w:val="nil"/>
-        </w:pBdr>
-        <w:jc w:val="both"/>
-        <w:rPr>
-          <w:rFonts w:ascii="Times New Roman" w:eastAsia="Times New Roman" w:hAnsi="Times New Roman" w:cs="Times New Roman"/>
-          <w:sz w:val="24"/>
-          <w:szCs w:val="24"/>
-        </w:rPr>
-      </w:pPr>
-    </w:p>
-    <w:p>
-      <w:pPr>
-        <w:pBdr>
-          <w:top w:val="nil"/>
-          <w:left w:val="nil"/>
-          <w:bottom w:val="nil"/>
-          <w:right w:val="nil"/>
-          <w:between w:val="nil"/>
-        </w:pBdr>
-        <w:jc w:val="both"/>
-        <w:rPr>
-          <w:rFonts w:ascii="Times New Roman" w:eastAsia="Times New Roman" w:hAnsi="Times New Roman" w:cs="Times New Roman"/>
-          <w:sz w:val="24"/>
-          <w:szCs w:val="24"/>
-        </w:rPr>
-      </w:pPr>
-      <w:proofErr w:type="spellStart"/>
-      <w:r>
-        <w:rPr>
-          <w:rFonts w:ascii="Times New Roman" w:eastAsia="Times New Roman" w:hAnsi="Times New Roman" w:cs="Times New Roman"/>
-          <w:sz w:val="24"/>
-          <w:szCs w:val="24"/>
-        </w:rPr>
-        <w:t>sdfsdfdsf</w:t>
-      </w:r>
-      <w:proofErr w:type="spellEnd"/>
-    </w:p>
-    <w:p>
-      <w:pPr>
-        <w:pBdr>
-          <w:top w:val="nil"/>
-          <w:left w:val="nil"/>
-          <w:bottom w:val="nil"/>
-          <w:right w:val="nil"/>
-          <w:between w:val="nil"/>
-        </w:pBdr>
-        <w:jc w:val="both"/>
-        <w:rPr>
-          <w:rFonts w:ascii="Times New Roman" w:eastAsia="Times New Roman" w:hAnsi="Times New Roman" w:cs="Times New Roman"/>
-          <w:sz w:val="24"/>
-          <w:szCs w:val="24"/>
-        </w:rPr>
-      </w:pPr>
-    </w:p>
-    <w:p>
-      <w:pPr>
-        <w:pBdr>
-          <w:top w:val="nil"/>
-          <w:left w:val="nil"/>
-          <w:bottom w:val="nil"/>
-          <w:right w:val="nil"/>
-          <w:between w:val="nil"/>
-        </w:pBdr>
-        <w:jc w:val="both"/>
-        <w:rPr>
-          <w:rFonts w:ascii="Times New Roman" w:eastAsia="Times New Roman" w:hAnsi="Times New Roman" w:cs="Times New Roman"/>
-          <w:sz w:val="24"/>
-          <w:szCs w:val="24"/>
-        </w:rPr>
-      </w:pPr>
-    </w:p>
-    <w:p>
-      <w:pPr>
-        <w:pBdr>
-          <w:top w:val="nil"/>
-          <w:left w:val="nil"/>
-          <w:bottom w:val="nil"/>
-          <w:right w:val="nil"/>
-          <w:between w:val="nil"/>
-        </w:pBdr>
-        <w:rPr>
-          <w:b/>
-          <w:sz w:val="28"/>
-          <w:szCs w:val="28"/>
-        </w:rPr>
-      </w:pPr>
-      <w:r>
-        <w:rPr>
-          <w:b/>
-          <w:sz w:val="28"/>
-          <w:szCs w:val="28"/>
-        </w:rPr>
-        <w:t>1.</w:t>
-      </w:r>
-      <w:r>
-        <w:rPr>
-          <w:b/>
-          <w:sz w:val="28"/>
-          <w:szCs w:val="28"/>
-        </w:rPr>
-        <w:t>3</w:t>
-      </w:r>
-      <w:r>
-        <w:rPr>
-          <w:b/>
-          <w:sz w:val="28"/>
-          <w:szCs w:val="28"/>
-        </w:rPr>
-        <w:t>.</w:t>
-      </w:r>
-      <w:r>
-        <w:rPr>
-          <w:b/>
-          <w:sz w:val="28"/>
-          <w:szCs w:val="28"/>
-        </w:rPr>
-        <w:t>3</w:t>
-      </w:r>
-      <w:r>
-        <w:rPr>
-          <w:b/>
-          <w:sz w:val="28"/>
-          <w:szCs w:val="28"/>
-        </w:rPr>
-        <w:t xml:space="preserve">.- </w:t>
-      </w:r>
-      <w:r>
-        <w:rPr>
-          <w:b/>
-          <w:sz w:val="28"/>
-          <w:szCs w:val="28"/>
-        </w:rPr>
         <w:t>Objetivos personales</w:t>
       </w:r>
     </w:p>
@@ -2484,84 +2589,97 @@
           <w:szCs w:val="24"/>
         </w:rPr>
       </w:pPr>
-      <w:proofErr w:type="spellStart"/>
-      <w:r>
-        <w:rPr>
-          <w:rFonts w:ascii="Times New Roman" w:eastAsia="Times New Roman" w:hAnsi="Times New Roman" w:cs="Times New Roman"/>
-          <w:sz w:val="24"/>
-          <w:szCs w:val="24"/>
-        </w:rPr>
-        <w:t>sdfsdfsdf</w:t>
-      </w:r>
-      <w:proofErr w:type="spellEnd"/>
-    </w:p>
-    <w:p>
-      <w:pPr>
-        <w:pBdr>
-          <w:top w:val="nil"/>
-          <w:left w:val="nil"/>
-          <w:bottom w:val="nil"/>
-          <w:right w:val="nil"/>
-          <w:between w:val="nil"/>
-        </w:pBdr>
-        <w:jc w:val="both"/>
-        <w:rPr>
-          <w:rFonts w:ascii="Times New Roman" w:eastAsia="Times New Roman" w:hAnsi="Times New Roman" w:cs="Times New Roman"/>
-          <w:sz w:val="24"/>
-          <w:szCs w:val="24"/>
-        </w:rPr>
-      </w:pPr>
-    </w:p>
-    <w:p>
-      <w:pPr>
-        <w:pBdr>
-          <w:top w:val="nil"/>
-          <w:left w:val="nil"/>
-          <w:bottom w:val="nil"/>
-          <w:right w:val="nil"/>
-          <w:between w:val="nil"/>
-        </w:pBdr>
-        <w:jc w:val="both"/>
-        <w:rPr>
-          <w:rFonts w:ascii="Times New Roman" w:eastAsia="Times New Roman" w:hAnsi="Times New Roman" w:cs="Times New Roman"/>
-          <w:sz w:val="24"/>
-          <w:szCs w:val="24"/>
-        </w:rPr>
-      </w:pPr>
-      <w:r>
-        <w:rPr>
-          <w:rFonts w:ascii="Times New Roman" w:eastAsia="Times New Roman" w:hAnsi="Times New Roman" w:cs="Times New Roman"/>
-          <w:sz w:val="24"/>
-          <w:szCs w:val="24"/>
-        </w:rPr>
-        <w:t xml:space="preserve">El tercer apartado del capítulo 1 debe contener los objetivos del proyecto, una descripción detallada de qué es lo que se quiere conseguir, pudiéndose dividir en subapartados (si el alumno lo ve oportuno) para distinguir entre “Objetivos principales”, “Objetivos secundarios” e incluso “Objetivos personales”, estos último serían los objetivos que persigue el propio alumno, más allá de que la aplicación final sea útil y funcional, como por ejemplo, aprender una nuevo lenguaje, tecnología o método de desarrollo y/o trabajo, aplicar los </w:t>
-      </w:r>
-      <w:r>
-        <w:rPr>
-          <w:rFonts w:ascii="Times New Roman" w:eastAsia="Times New Roman" w:hAnsi="Times New Roman" w:cs="Times New Roman"/>
-          <w:sz w:val="24"/>
-          <w:szCs w:val="24"/>
-        </w:rPr>
-        <w:lastRenderedPageBreak/>
-        <w:t xml:space="preserve">conocimientos adquiridos en la carrera, llegar a desarrollar un producto al que poder sacar un rendimiento, </w:t>
-      </w:r>
-      <w:proofErr w:type="spellStart"/>
-      <w:r>
-        <w:rPr>
-          <w:rFonts w:ascii="Times New Roman" w:eastAsia="Times New Roman" w:hAnsi="Times New Roman" w:cs="Times New Roman"/>
-          <w:sz w:val="24"/>
-          <w:szCs w:val="24"/>
-        </w:rPr>
-        <w:t>etc</w:t>
-      </w:r>
-      <w:proofErr w:type="spellEnd"/>
-      <w:r>
-        <w:rPr>
-          <w:rFonts w:ascii="Times New Roman" w:eastAsia="Times New Roman" w:hAnsi="Times New Roman" w:cs="Times New Roman"/>
-          <w:sz w:val="24"/>
-          <w:szCs w:val="24"/>
-        </w:rPr>
-        <w:t>…</w:t>
+      <w:r>
+        <w:rPr>
+          <w:rFonts w:ascii="Times New Roman" w:eastAsia="Times New Roman" w:hAnsi="Times New Roman" w:cs="Times New Roman"/>
+          <w:sz w:val="24"/>
+          <w:szCs w:val="24"/>
+        </w:rPr>
+        <w:t>Además de los objetivos relacionados con el desarrollo de la aplicación, la realización de este proyecto también persigue una serie de objetivos personales relacionados con la formación académica y profesional del autor.</w:t>
+      </w:r>
+    </w:p>
+    <w:p>
+      <w:pPr>
+        <w:pBdr>
+          <w:top w:val="nil"/>
+          <w:left w:val="nil"/>
+          <w:bottom w:val="nil"/>
+          <w:right w:val="nil"/>
+          <w:between w:val="nil"/>
+        </w:pBdr>
+        <w:jc w:val="both"/>
+        <w:rPr>
+          <w:rFonts w:ascii="Times New Roman" w:eastAsia="Times New Roman" w:hAnsi="Times New Roman" w:cs="Times New Roman"/>
+          <w:sz w:val="24"/>
+          <w:szCs w:val="24"/>
+        </w:rPr>
+      </w:pPr>
+    </w:p>
+    <w:p>
+      <w:pPr>
+        <w:pBdr>
+          <w:top w:val="nil"/>
+          <w:left w:val="nil"/>
+          <w:bottom w:val="nil"/>
+          <w:right w:val="nil"/>
+          <w:between w:val="nil"/>
+        </w:pBdr>
+        <w:jc w:val="both"/>
+        <w:rPr>
+          <w:rFonts w:ascii="Times New Roman" w:eastAsia="Times New Roman" w:hAnsi="Times New Roman" w:cs="Times New Roman"/>
+          <w:sz w:val="24"/>
+          <w:szCs w:val="24"/>
+        </w:rPr>
+      </w:pPr>
+      <w:r>
+        <w:rPr>
+          <w:rFonts w:ascii="Times New Roman" w:eastAsia="Times New Roman" w:hAnsi="Times New Roman" w:cs="Times New Roman"/>
+          <w:sz w:val="24"/>
+          <w:szCs w:val="24"/>
+        </w:rPr>
+        <w:t>Entre ellos se encuentran la aplicación práctica de los conocimientos adquiridos durante el grado en áreas como la programación, las bases de datos y el desarrollo de aplicaciones web. Asimismo, el proyecto permite adquirir experiencia en el uso de tecnologías actuales utilizadas en el desarrollo de software y comprender mejor el proceso completo de diseño, desarrollo e implementación de una aplicación informática.</w:t>
+      </w:r>
+    </w:p>
+    <w:p>
+      <w:pPr>
+        <w:pBdr>
+          <w:top w:val="nil"/>
+          <w:left w:val="nil"/>
+          <w:bottom w:val="nil"/>
+          <w:right w:val="nil"/>
+          <w:between w:val="nil"/>
+        </w:pBdr>
+        <w:jc w:val="both"/>
+        <w:rPr>
+          <w:rFonts w:ascii="Times New Roman" w:eastAsia="Times New Roman" w:hAnsi="Times New Roman" w:cs="Times New Roman"/>
+          <w:sz w:val="24"/>
+          <w:szCs w:val="24"/>
+        </w:rPr>
+      </w:pPr>
+    </w:p>
+    <w:p>
+      <w:pPr>
+        <w:pBdr>
+          <w:top w:val="nil"/>
+          <w:left w:val="nil"/>
+          <w:bottom w:val="nil"/>
+          <w:right w:val="nil"/>
+          <w:between w:val="nil"/>
+        </w:pBdr>
+        <w:jc w:val="both"/>
+        <w:rPr>
+          <w:rFonts w:ascii="Times New Roman" w:eastAsia="Times New Roman" w:hAnsi="Times New Roman" w:cs="Times New Roman"/>
+          <w:sz w:val="24"/>
+          <w:szCs w:val="24"/>
+        </w:rPr>
+      </w:pPr>
+      <w:r>
+        <w:rPr>
+          <w:rFonts w:ascii="Times New Roman" w:eastAsia="Times New Roman" w:hAnsi="Times New Roman" w:cs="Times New Roman"/>
+          <w:sz w:val="24"/>
+          <w:szCs w:val="24"/>
+        </w:rPr>
+        <w:t>El tercer apartado del capítulo 1 debe contener los objetivos del proyecto, una descripción detallada de qué es lo que se quiere conseguir, pudiéndose dividir en subapartados (si el alumno lo ve oportuno) para distinguir entre “Objetivos principales”, “Objetivos secundarios” e incluso “Objetivos personales”, estos último serían los objetivos que persigue el propio alumno, más allá de que la aplicación final sea útil y funcional, como por ejemplo, aprender una nuevo lenguaje, tecnología o método de desarrollo y/o trabajo, aplicar los conocimientos adquiridos en la carrera, llegar a desarrollar un producto al que poder sacar un rendimiento, etc…</w:t>
       </w:r>
     </w:p>
     <w:p>
@@ -2661,25 +2779,184 @@
           <w:sz w:val="24"/>
           <w:szCs w:val="24"/>
         </w:rPr>
-        <w:t xml:space="preserve">Este apartado es </w:t>
-      </w:r>
-      <w:proofErr w:type="gramStart"/>
-      <w:r>
-        <w:rPr>
-          <w:rFonts w:ascii="Times New Roman" w:eastAsia="Times New Roman" w:hAnsi="Times New Roman" w:cs="Times New Roman"/>
-          <w:sz w:val="24"/>
-          <w:szCs w:val="24"/>
-        </w:rPr>
-        <w:t>opcional</w:t>
-      </w:r>
-      <w:proofErr w:type="gramEnd"/>
-      <w:r>
-        <w:rPr>
-          <w:rFonts w:ascii="Times New Roman" w:eastAsia="Times New Roman" w:hAnsi="Times New Roman" w:cs="Times New Roman"/>
-          <w:sz w:val="24"/>
-          <w:szCs w:val="24"/>
-        </w:rPr>
-        <w:t xml:space="preserve"> pero en algunos casos podría ser necesario, consistiría en describir aquellas cosas que NO SE VAN A HACER. Si tras describir los objetivos pudiera entenderse que el desarrollo a realizar va a tener una funcionalidad o prestaciones por encima de las previstas por el alumno, en un caso así viene bien aclarar, y para eso sería este apartado, que cosas quedan fuera del ámbito del trabajo que se presenta.</w:t>
+        <w:t>Aunque la aplicación desarrollada pretende ofrecer una herramienta útil para mejorar la organización del cuidado de las mascotas, es necesario establecer ciertos límites en cuanto al alcance del proyecto.</w:t>
+      </w:r>
+    </w:p>
+    <w:p>
+      <w:pPr>
+        <w:pBdr>
+          <w:top w:val="nil"/>
+          <w:left w:val="nil"/>
+          <w:bottom w:val="nil"/>
+          <w:right w:val="nil"/>
+          <w:between w:val="nil"/>
+        </w:pBdr>
+        <w:jc w:val="both"/>
+        <w:rPr>
+          <w:rFonts w:ascii="Times New Roman" w:eastAsia="Times New Roman" w:hAnsi="Times New Roman" w:cs="Times New Roman"/>
+          <w:sz w:val="24"/>
+          <w:szCs w:val="24"/>
+        </w:rPr>
+      </w:pPr>
+    </w:p>
+    <w:p>
+      <w:pPr>
+        <w:pBdr>
+          <w:top w:val="nil"/>
+          <w:left w:val="nil"/>
+          <w:bottom w:val="nil"/>
+          <w:right w:val="nil"/>
+          <w:between w:val="nil"/>
+        </w:pBdr>
+        <w:jc w:val="both"/>
+        <w:rPr>
+          <w:rFonts w:ascii="Times New Roman" w:eastAsia="Times New Roman" w:hAnsi="Times New Roman" w:cs="Times New Roman"/>
+          <w:sz w:val="24"/>
+          <w:szCs w:val="24"/>
+        </w:rPr>
+      </w:pPr>
+      <w:r>
+        <w:rPr>
+          <w:rFonts w:ascii="Times New Roman" w:eastAsia="Times New Roman" w:hAnsi="Times New Roman" w:cs="Times New Roman"/>
+          <w:sz w:val="24"/>
+          <w:szCs w:val="24"/>
+        </w:rPr>
+        <w:t>En primer lugar, la aplicación está orientada principalmente al uso doméstico, es decir, a hogares donde varias personas participan en el cuidado de una o varias mascotas. Por tanto</w:t>
+      </w:r>
+      <w:r>
+        <w:rPr>
+          <w:rFonts w:ascii="Times New Roman" w:eastAsia="Times New Roman" w:hAnsi="Times New Roman" w:cs="Times New Roman"/>
+          <w:sz w:val="24"/>
+          <w:szCs w:val="24"/>
+        </w:rPr>
+        <w:t>, el sistema no está diseñado para su utilización en entornos profesionales como clínicas veterinarias o centros especializados en el cuidado animal.</w:t>
+      </w:r>
+    </w:p>
+    <w:p>
+      <w:pPr>
+        <w:pBdr>
+          <w:top w:val="nil"/>
+          <w:left w:val="nil"/>
+          <w:bottom w:val="nil"/>
+          <w:right w:val="nil"/>
+          <w:between w:val="nil"/>
+        </w:pBdr>
+        <w:jc w:val="both"/>
+        <w:rPr>
+          <w:rFonts w:ascii="Times New Roman" w:eastAsia="Times New Roman" w:hAnsi="Times New Roman" w:cs="Times New Roman"/>
+          <w:sz w:val="24"/>
+          <w:szCs w:val="24"/>
+        </w:rPr>
+      </w:pPr>
+    </w:p>
+    <w:p>
+      <w:pPr>
+        <w:pBdr>
+          <w:top w:val="nil"/>
+          <w:left w:val="nil"/>
+          <w:bottom w:val="nil"/>
+          <w:right w:val="nil"/>
+          <w:between w:val="nil"/>
+        </w:pBdr>
+        <w:jc w:val="both"/>
+        <w:rPr>
+          <w:rFonts w:ascii="Times New Roman" w:eastAsia="Times New Roman" w:hAnsi="Times New Roman" w:cs="Times New Roman"/>
+          <w:sz w:val="24"/>
+          <w:szCs w:val="24"/>
+        </w:rPr>
+      </w:pPr>
+      <w:r>
+        <w:rPr>
+          <w:rFonts w:ascii="Times New Roman" w:eastAsia="Times New Roman" w:hAnsi="Times New Roman" w:cs="Times New Roman"/>
+          <w:sz w:val="24"/>
+          <w:szCs w:val="24"/>
+        </w:rPr>
+        <w:lastRenderedPageBreak/>
+        <w:t>Asimismo, el desarrollo se centra en la creación de una aplicación web accesible desde distintos dispositivos mediante un navegador, por lo que no se contempla el desarrollo de aplicaciones móviles nativas para plataformas como Android o iOS.</w:t>
+      </w:r>
+    </w:p>
+    <w:p>
+      <w:pPr>
+        <w:pBdr>
+          <w:top w:val="nil"/>
+          <w:left w:val="nil"/>
+          <w:bottom w:val="nil"/>
+          <w:right w:val="nil"/>
+          <w:between w:val="nil"/>
+        </w:pBdr>
+        <w:jc w:val="both"/>
+        <w:rPr>
+          <w:rFonts w:ascii="Times New Roman" w:eastAsia="Times New Roman" w:hAnsi="Times New Roman" w:cs="Times New Roman"/>
+          <w:sz w:val="24"/>
+          <w:szCs w:val="24"/>
+        </w:rPr>
+      </w:pPr>
+    </w:p>
+    <w:p>
+      <w:pPr>
+        <w:pBdr>
+          <w:top w:val="nil"/>
+          <w:left w:val="nil"/>
+          <w:bottom w:val="nil"/>
+          <w:right w:val="nil"/>
+          <w:between w:val="nil"/>
+        </w:pBdr>
+        <w:jc w:val="both"/>
+        <w:rPr>
+          <w:rFonts w:ascii="Times New Roman" w:eastAsia="Times New Roman" w:hAnsi="Times New Roman" w:cs="Times New Roman"/>
+          <w:sz w:val="24"/>
+          <w:szCs w:val="24"/>
+        </w:rPr>
+      </w:pPr>
+      <w:r>
+        <w:rPr>
+          <w:rFonts w:ascii="Times New Roman" w:eastAsia="Times New Roman" w:hAnsi="Times New Roman" w:cs="Times New Roman"/>
+          <w:sz w:val="24"/>
+          <w:szCs w:val="24"/>
+        </w:rPr>
+        <w:t>Por otro lado, el proyecto se limita a la implementación de las funcionalidades principales relacionadas con la gestión del cuidado de las mascotas, como el registro de información sobre los animales, la gestión de medicación y otras actividades relacionadas con su cuidado. Funcionalidades más avanzadas, como la integración con servicios externos o el uso de sistemas de notificaciones más complejos, quedan fuera del alcance del presente trabajo y podrían considerarse posibles mejoras en futuras versiones de la aplicación.</w:t>
+      </w:r>
+    </w:p>
+    <w:p>
+      <w:pPr>
+        <w:pBdr>
+          <w:top w:val="nil"/>
+          <w:left w:val="nil"/>
+          <w:bottom w:val="nil"/>
+          <w:right w:val="nil"/>
+          <w:between w:val="nil"/>
+        </w:pBdr>
+        <w:jc w:val="both"/>
+        <w:rPr>
+          <w:rFonts w:ascii="Times New Roman" w:eastAsia="Times New Roman" w:hAnsi="Times New Roman" w:cs="Times New Roman"/>
+          <w:sz w:val="24"/>
+          <w:szCs w:val="24"/>
+        </w:rPr>
+      </w:pPr>
+    </w:p>
+    <w:p>
+      <w:pPr>
+        <w:pBdr>
+          <w:top w:val="nil"/>
+          <w:left w:val="nil"/>
+          <w:bottom w:val="nil"/>
+          <w:right w:val="nil"/>
+          <w:between w:val="nil"/>
+        </w:pBdr>
+        <w:jc w:val="both"/>
+        <w:rPr>
+          <w:rFonts w:ascii="Times New Roman" w:eastAsia="Times New Roman" w:hAnsi="Times New Roman" w:cs="Times New Roman"/>
+          <w:sz w:val="24"/>
+          <w:szCs w:val="24"/>
+        </w:rPr>
+      </w:pPr>
+      <w:r>
+        <w:rPr>
+          <w:rFonts w:ascii="Times New Roman" w:eastAsia="Times New Roman" w:hAnsi="Times New Roman" w:cs="Times New Roman"/>
+          <w:sz w:val="24"/>
+          <w:szCs w:val="24"/>
+        </w:rPr>
+        <w:t>Este apartado es opcional pero en algunos casos podría ser necesario, consistiría en describir aquellas cosas que NO SE VAN A HACER. Si tras describir los objetivos pudiera entenderse que el desarrollo a realizar va a tener una funcionalidad o prestaciones por encima de las previstas por el alumno, en un caso así viene bien aclarar, y para eso sería este apartado, que cosas quedan fuera del ámbito del trabajo que se presenta.</w:t>
       </w:r>
     </w:p>
     <w:p>
@@ -2712,6 +2989,119 @@
 <file path=word/numbering.xml><?xml version="1.0" encoding="utf-8"?>
 <w:numbering xmlns:wpc="http://schemas.microsoft.com/office/word/2010/wordprocessingCanvas" xmlns:cx="http://schemas.microsoft.com/office/drawing/2014/chartex" xmlns:cx1="http://schemas.microsoft.com/office/drawing/2015/9/8/chartex" xmlns:cx2="http://schemas.microsoft.com/office/drawing/2015/10/21/chartex" xmlns:cx3="http://schemas.microsoft.com/office/drawing/2016/5/9/chartex" xmlns:cx4="http://schemas.microsoft.com/office/drawing/2016/5/10/chartex" xmlns:cx5="http://schemas.microsoft.com/office/drawing/2016/5/11/chartex" xmlns:cx6="http://schemas.microsoft.com/office/drawing/2016/5/12/chartex" xmlns:cx7="http://schemas.microsoft.com/office/drawing/2016/5/13/chartex" xmlns:cx8="http://schemas.microsoft.com/office/drawing/2016/5/14/chartex" xmlns:mc="http://schemas.openxmlformats.org/markup-compatibility/2006" xmlns:aink="http://schemas.microsoft.com/office/drawing/2016/ink" xmlns:am3d="http://schemas.microsoft.com/office/drawing/2017/model3d" xmlns:o="urn:schemas-microsoft-com:office:office" xmlns:oel="http://schemas.microsoft.com/office/2019/extlst" xmlns:r="http://schemas.openxmlformats.org/officeDocument/2006/relationships" xmlns:m="http://schemas.openxmlformats.org/officeDocument/2006/math" xmlns:v="urn:schemas-microsoft-com:vml" xmlns:wp14="http://schemas.microsoft.com/office/word/2010/wordprocessingDrawing" xmlns:wp="http://schemas.openxmlformats.org/drawingml/2006/wordprocessingDrawing" xmlns:w10="urn:schemas-microsoft-com:office:word" xmlns:w="http://schemas.openxmlformats.org/wordprocessingml/2006/main" xmlns:w14="http://schemas.microsoft.com/office/word/2010/wordml" xmlns:w15="http://schemas.microsoft.com/office/word/2012/wordml" xmlns:w16cex="http://schemas.microsoft.com/office/word/2018/wordml/cex" xmlns:w16cid="http://schemas.microsoft.com/office/word/2016/wordml/cid" xmlns:w16="http://schemas.microsoft.com/office/word/2018/wordml" xmlns:w16du="http://schemas.microsoft.com/office/word/2023/wordml/word16du" xmlns:w16sdtdh="http://schemas.microsoft.com/office/word/2020/wordml/sdtdatahash" xmlns:w16sdtfl="http://schemas.microsoft.com/office/word/2024/wordml/sdtformatlock" xmlns:w16se="http://schemas.microsoft.com/office/word/2015/wordml/symex" xmlns:wpg="http://schemas.microsoft.com/office/word/2010/wordprocessingGroup" xmlns:wpi="http://schemas.microsoft.com/office/word/2010/wordprocessingInk" xmlns:wne="http://schemas.microsoft.com/office/word/2006/wordml" xmlns:wps="http://schemas.microsoft.com/office/word/2010/wordprocessingShape" mc:Ignorable="w14 w15 w16se w16cid w16 w16cex w16sdtdh w16sdtfl w16du wp14">
   <w:abstractNum w:abstractNumId="0" w15:restartNumberingAfterBreak="0">
+    <w:nsid w:val="1CEC410C"/>
+    <w:multiLevelType w:val="hybridMultilevel"/>
+    <w:tmpl w:val="9E800192"/>
+    <w:lvl w:ilvl="0" w:tplc="0C0A0001">
+      <w:start w:val="1"/>
+      <w:numFmt w:val="bullet"/>
+      <w:lvlText w:val=""/>
+      <w:lvlJc w:val="left"/>
+      <w:pPr>
+        <w:ind w:left="720" w:hanging="360"/>
+      </w:pPr>
+      <w:rPr>
+        <w:rFonts w:ascii="Symbol" w:eastAsia="Times New Roman" w:hAnsi="Symbol" w:cs="Times New Roman" w:hint="default"/>
+      </w:rPr>
+    </w:lvl>
+    <w:lvl w:ilvl="1" w:tplc="0C0A0003" w:tentative="1">
+      <w:start w:val="1"/>
+      <w:numFmt w:val="bullet"/>
+      <w:lvlText w:val="o"/>
+      <w:lvlJc w:val="left"/>
+      <w:pPr>
+        <w:ind w:left="1440" w:hanging="360"/>
+      </w:pPr>
+      <w:rPr>
+        <w:rFonts w:ascii="Courier New" w:hAnsi="Courier New" w:cs="Courier New" w:hint="default"/>
+      </w:rPr>
+    </w:lvl>
+    <w:lvl w:ilvl="2" w:tplc="0C0A0005" w:tentative="1">
+      <w:start w:val="1"/>
+      <w:numFmt w:val="bullet"/>
+      <w:lvlText w:val=""/>
+      <w:lvlJc w:val="left"/>
+      <w:pPr>
+        <w:ind w:left="2160" w:hanging="360"/>
+      </w:pPr>
+      <w:rPr>
+        <w:rFonts w:ascii="Wingdings" w:hAnsi="Wingdings" w:hint="default"/>
+      </w:rPr>
+    </w:lvl>
+    <w:lvl w:ilvl="3" w:tplc="0C0A0001" w:tentative="1">
+      <w:start w:val="1"/>
+      <w:numFmt w:val="bullet"/>
+      <w:lvlText w:val=""/>
+      <w:lvlJc w:val="left"/>
+      <w:pPr>
+        <w:ind w:left="2880" w:hanging="360"/>
+      </w:pPr>
+      <w:rPr>
+        <w:rFonts w:ascii="Symbol" w:hAnsi="Symbol" w:hint="default"/>
+      </w:rPr>
+    </w:lvl>
+    <w:lvl w:ilvl="4" w:tplc="0C0A0003" w:tentative="1">
+      <w:start w:val="1"/>
+      <w:numFmt w:val="bullet"/>
+      <w:lvlText w:val="o"/>
+      <w:lvlJc w:val="left"/>
+      <w:pPr>
+        <w:ind w:left="3600" w:hanging="360"/>
+      </w:pPr>
+      <w:rPr>
+        <w:rFonts w:ascii="Courier New" w:hAnsi="Courier New" w:cs="Courier New" w:hint="default"/>
+      </w:rPr>
+    </w:lvl>
+    <w:lvl w:ilvl="5" w:tplc="0C0A0005" w:tentative="1">
+      <w:start w:val="1"/>
+      <w:numFmt w:val="bullet"/>
+      <w:lvlText w:val=""/>
+      <w:lvlJc w:val="left"/>
+      <w:pPr>
+        <w:ind w:left="4320" w:hanging="360"/>
+      </w:pPr>
+      <w:rPr>
+        <w:rFonts w:ascii="Wingdings" w:hAnsi="Wingdings" w:hint="default"/>
+      </w:rPr>
+    </w:lvl>
+    <w:lvl w:ilvl="6" w:tplc="0C0A0001" w:tentative="1">
+      <w:start w:val="1"/>
+      <w:numFmt w:val="bullet"/>
+      <w:lvlText w:val=""/>
+      <w:lvlJc w:val="left"/>
+      <w:pPr>
+        <w:ind w:left="5040" w:hanging="360"/>
+      </w:pPr>
+      <w:rPr>
+        <w:rFonts w:ascii="Symbol" w:hAnsi="Symbol" w:hint="default"/>
+      </w:rPr>
+    </w:lvl>
+    <w:lvl w:ilvl="7" w:tplc="0C0A0003" w:tentative="1">
+      <w:start w:val="1"/>
+      <w:numFmt w:val="bullet"/>
+      <w:lvlText w:val="o"/>
+      <w:lvlJc w:val="left"/>
+      <w:pPr>
+        <w:ind w:left="5760" w:hanging="360"/>
+      </w:pPr>
+      <w:rPr>
+        <w:rFonts w:ascii="Courier New" w:hAnsi="Courier New" w:cs="Courier New" w:hint="default"/>
+      </w:rPr>
+    </w:lvl>
+    <w:lvl w:ilvl="8" w:tplc="0C0A0005" w:tentative="1">
+      <w:start w:val="1"/>
+      <w:numFmt w:val="bullet"/>
+      <w:lvlText w:val=""/>
+      <w:lvlJc w:val="left"/>
+      <w:pPr>
+        <w:ind w:left="6480" w:hanging="360"/>
+      </w:pPr>
+      <w:rPr>
+        <w:rFonts w:ascii="Wingdings" w:hAnsi="Wingdings" w:hint="default"/>
+      </w:rPr>
+    </w:lvl>
+  </w:abstractNum>
+  <w:abstractNum w:abstractNumId="1" w15:restartNumberingAfterBreak="0">
     <w:nsid w:val="410F300A"/>
     <w:multiLevelType w:val="hybridMultilevel"/>
     <w:tmpl w:val="32C63CA4"/>
@@ -2824,7 +3214,7 @@
       </w:rPr>
     </w:lvl>
   </w:abstractNum>
-  <w:abstractNum w:abstractNumId="1" w15:restartNumberingAfterBreak="0">
+  <w:abstractNum w:abstractNumId="2" w15:restartNumberingAfterBreak="0">
     <w:nsid w:val="65356484"/>
     <w:multiLevelType w:val="hybridMultilevel"/>
     <w:tmpl w:val="F8240C1E"/>
@@ -2936,7 +3326,7 @@
       </w:rPr>
     </w:lvl>
   </w:abstractNum>
-  <w:abstractNum w:abstractNumId="2" w15:restartNumberingAfterBreak="0">
+  <w:abstractNum w:abstractNumId="3" w15:restartNumberingAfterBreak="0">
     <w:nsid w:val="6CAE2F44"/>
     <w:multiLevelType w:val="hybridMultilevel"/>
     <w:tmpl w:val="73B08C9A"/>
@@ -3049,12 +3439,15 @@
     </w:lvl>
   </w:abstractNum>
   <w:num w:numId="1" w16cid:durableId="325398035">
+    <w:abstractNumId w:val="3"/>
+  </w:num>
+  <w:num w:numId="2" w16cid:durableId="534654579">
     <w:abstractNumId w:val="2"/>
   </w:num>
-  <w:num w:numId="2" w16cid:durableId="534654579">
+  <w:num w:numId="3" w16cid:durableId="1229727737">
     <w:abstractNumId w:val="1"/>
   </w:num>
-  <w:num w:numId="3" w16cid:durableId="1229727737">
+  <w:num w:numId="4" w16cid:durableId="393352354">
     <w:abstractNumId w:val="0"/>
   </w:num>
 </w:numbering>

</xml_diff>